<commit_message>
Added discussion of ILL
</commit_message>
<xml_diff>
--- a/Issues in Self-checkout.docx
+++ b/Issues in Self-checkout.docx
@@ -1636,65 +1636,61 @@
           <w:b/>
           <w:bCs/>
         </w:rPr>
-        <w:t>Help</w:t>
-      </w:r>
-    </w:p>
-    <w:p>
-      <w:r>
-        <w:t xml:space="preserve">At my local branch in </w:t>
-      </w:r>
-      <w:r>
-        <w:t>Las Vegas</w:t>
-      </w:r>
-      <w:r>
-        <w:t>, there</w:t>
-      </w:r>
-      <w:r>
-        <w:t xml:space="preserve"> was</w:t>
-      </w:r>
-      <w:r>
-        <w:t xml:space="preserve"> </w:t>
-      </w:r>
-      <w:r>
-        <w:t>a staff member</w:t>
-      </w:r>
-      <w:r>
-        <w:t xml:space="preserve"> standing near the self-checkout systems </w:t>
-      </w:r>
-      <w:r>
-        <w:t xml:space="preserve">ready </w:t>
-      </w:r>
-      <w:r>
-        <w:t xml:space="preserve">to </w:t>
-      </w:r>
-      <w:r>
-        <w:t xml:space="preserve">offer help </w:t>
-      </w:r>
-      <w:r>
-        <w:t xml:space="preserve">to </w:t>
-      </w:r>
-      <w:r>
-        <w:t>any</w:t>
-      </w:r>
-      <w:r>
-        <w:t xml:space="preserve"> patron who seem</w:t>
-      </w:r>
-      <w:r>
-        <w:t>s</w:t>
-      </w:r>
-      <w:r>
-        <w:t xml:space="preserve"> to be having difficulty.</w:t>
-      </w:r>
-    </w:p>
-    <w:p>
-      <w:r>
-        <w:t>I’m</w:t>
-      </w:r>
-      <w:r>
-        <w:t xml:space="preserve"> in two minds about this.</w:t>
-      </w:r>
-      <w:r>
-        <w:t xml:space="preserve">  It’s good to have help easily available, but it seems a bit intrusive to have someone hovering over you.</w:t>
+        <w:t>I</w:t>
+      </w:r>
+      <w:r>
+        <w:rPr>
+          <w:b/>
+          <w:bCs/>
+        </w:rPr>
+        <w:t>nter-Library Loan</w:t>
+      </w:r>
+    </w:p>
+    <w:p>
+      <w:r>
+        <w:t>One final question</w:t>
+      </w:r>
+      <w:r>
+        <w:t>:  will</w:t>
+      </w:r>
+      <w:r>
+        <w:t xml:space="preserve"> you allow self-checkout for Inter</w:t>
+      </w:r>
+      <w:r>
+        <w:t xml:space="preserve">-Library Loan?  Las Vegas does not, since ILL </w:t>
+      </w:r>
+      <w:r>
+        <w:t>must</w:t>
+      </w:r>
+      <w:r>
+        <w:t xml:space="preserve"> be picked up at the reference desk; Frederick does, since ILL goes on the hold shelves along with other holds.  The wrinkle for </w:t>
+      </w:r>
+      <w:r>
+        <w:t>Frederick is that there are two</w:t>
+      </w:r>
+      <w:r>
+        <w:t xml:space="preserve"> bar </w:t>
+      </w:r>
+      <w:r>
+        <w:t>codes on</w:t>
+      </w:r>
+      <w:r>
+        <w:t xml:space="preserve"> the item, one on the back </w:t>
+      </w:r>
+      <w:r>
+        <w:t xml:space="preserve">of the item </w:t>
+      </w:r>
+      <w:r>
+        <w:t>from the originating library and one on the ILL sleeve, and it’s not obvious</w:t>
+      </w:r>
+      <w:r>
+        <w:t xml:space="preserve"> which </w:t>
+      </w:r>
+      <w:r>
+        <w:t xml:space="preserve">to scan.  This could be made clear in the ILL sleeve itself, but I get the impression that the ILL sleeve </w:t>
+      </w:r>
+      <w:r>
+        <w:t>is immutable.</w:t>
       </w:r>
     </w:p>
     <w:p>
@@ -1710,6 +1706,80 @@
           <w:b/>
           <w:bCs/>
         </w:rPr>
+        <w:t>Help</w:t>
+      </w:r>
+    </w:p>
+    <w:p>
+      <w:r>
+        <w:t xml:space="preserve">At my local branch in </w:t>
+      </w:r>
+      <w:r>
+        <w:t>Las Vegas</w:t>
+      </w:r>
+      <w:r>
+        <w:t>, there</w:t>
+      </w:r>
+      <w:r>
+        <w:t xml:space="preserve"> was</w:t>
+      </w:r>
+      <w:r>
+        <w:t xml:space="preserve"> </w:t>
+      </w:r>
+      <w:r>
+        <w:t>a staff member</w:t>
+      </w:r>
+      <w:r>
+        <w:t xml:space="preserve"> standing near the self-checkout systems </w:t>
+      </w:r>
+      <w:r>
+        <w:t xml:space="preserve">ready </w:t>
+      </w:r>
+      <w:r>
+        <w:t xml:space="preserve">to </w:t>
+      </w:r>
+      <w:r>
+        <w:t xml:space="preserve">offer help </w:t>
+      </w:r>
+      <w:r>
+        <w:t xml:space="preserve">to </w:t>
+      </w:r>
+      <w:r>
+        <w:t>any</w:t>
+      </w:r>
+      <w:r>
+        <w:t xml:space="preserve"> patron who seem</w:t>
+      </w:r>
+      <w:r>
+        <w:t>s</w:t>
+      </w:r>
+      <w:r>
+        <w:t xml:space="preserve"> to be having difficulty.</w:t>
+      </w:r>
+    </w:p>
+    <w:p>
+      <w:r>
+        <w:t>I’m</w:t>
+      </w:r>
+      <w:r>
+        <w:t xml:space="preserve"> in two minds about this.</w:t>
+      </w:r>
+      <w:r>
+        <w:t xml:space="preserve">  It’s good to have help easily available, but it seems a bit intrusive to have someone hovering over you.</w:t>
+      </w:r>
+    </w:p>
+    <w:p>
+      <w:pPr>
+        <w:pStyle w:val="Heading3"/>
+        <w:rPr>
+          <w:b/>
+          <w:bCs/>
+        </w:rPr>
+      </w:pPr>
+      <w:r>
+        <w:rPr>
+          <w:b/>
+          <w:bCs/>
+        </w:rPr>
         <w:t>Coda</w:t>
       </w:r>
     </w:p>
@@ -1733,7 +1803,11 @@
         <w:t xml:space="preserve"> without talking to anyone.</w:t>
       </w:r>
       <w:r>
-        <w:t xml:space="preserve">  I strongly believe that patrons should be able to get the same level of service</w:t>
+        <w:t xml:space="preserve">  I strongly believe that patrons should be able to </w:t>
+      </w:r>
+      <w:r>
+        <w:lastRenderedPageBreak/>
+        <w:t>get the same level of service</w:t>
       </w:r>
       <w:r>
         <w:t xml:space="preserve"> with or without talking to a librarian, and that naturally puts a lot of emphasis on layout and signage.</w:t>

</xml_diff>